<commit_message>
Align thesis template with provided PDF
Co-authored-by: yschen499-dotcom <yschen499-dotcom@users.noreply.github.com>
</commit_message>
<xml_diff>
--- a/thesis/zust_undergraduate_thesis_template.docx
+++ b/thesis/zust_undergraduate_thesis_template.docx
@@ -4,6 +4,7 @@
   <w:body>
     <w:p>
       <w:pPr>
+        <w:spacing w:line="360" w:lineRule="auto"/>
         <w:jc w:val="left"/>
       </w:pPr>
       <w:r>
@@ -16,6 +17,7 @@
     </w:p>
     <w:p>
       <w:pPr>
+        <w:spacing w:line="360" w:lineRule="auto"/>
         <w:jc w:val="left"/>
       </w:pPr>
       <w:r>
@@ -28,6 +30,7 @@
     </w:p>
     <w:p>
       <w:pPr>
+        <w:spacing w:line="360" w:lineRule="auto"/>
         <w:jc w:val="left"/>
       </w:pPr>
       <w:r>
@@ -40,6 +43,7 @@
     </w:p>
     <w:p>
       <w:pPr>
+        <w:spacing w:line="360" w:lineRule="auto"/>
         <w:jc w:val="left"/>
       </w:pPr>
       <w:r>
@@ -52,6 +56,7 @@
     </w:p>
     <w:p>
       <w:pPr>
+        <w:spacing w:line="360" w:lineRule="auto"/>
         <w:jc w:val="center"/>
       </w:pPr>
       <w:r>
@@ -60,11 +65,12 @@
           <w:b/>
           <w:sz w:val="32"/>
         </w:rPr>
-        <w:t>浙江科技学院计算机学院</w:t>
+        <w:t>浙江科技大学计算机科学与技术学院</w:t>
       </w:r>
     </w:p>
     <w:p>
       <w:pPr>
+        <w:spacing w:line="360" w:lineRule="auto"/>
         <w:jc w:val="center"/>
       </w:pPr>
       <w:r>
@@ -73,11 +79,12 @@
           <w:b/>
           <w:sz w:val="36"/>
         </w:rPr>
-        <w:t>本科生毕业设计（论文）</w:t>
+        <w:t>本科毕业设计（论文）</w:t>
       </w:r>
     </w:p>
     <w:p>
       <w:pPr>
+        <w:spacing w:line="360" w:lineRule="auto"/>
         <w:jc w:val="left"/>
       </w:pPr>
       <w:r>
@@ -90,6 +97,7 @@
     </w:p>
     <w:p>
       <w:pPr>
+        <w:spacing w:line="360" w:lineRule="auto"/>
         <w:jc w:val="center"/>
       </w:pPr>
       <w:r>
@@ -103,6 +111,7 @@
     </w:p>
     <w:p>
       <w:pPr>
+        <w:spacing w:line="360" w:lineRule="auto"/>
         <w:jc w:val="left"/>
       </w:pPr>
       <w:r>
@@ -115,6 +124,7 @@
     </w:p>
     <w:p>
       <w:pPr>
+        <w:spacing w:line="360" w:lineRule="auto"/>
         <w:jc w:val="center"/>
       </w:pPr>
       <w:r>
@@ -128,6 +138,7 @@
     </w:p>
     <w:p>
       <w:pPr>
+        <w:spacing w:line="360" w:lineRule="auto"/>
         <w:jc w:val="center"/>
       </w:pPr>
       <w:r>
@@ -141,6 +152,7 @@
     </w:p>
     <w:p>
       <w:pPr>
+        <w:spacing w:line="360" w:lineRule="auto"/>
         <w:jc w:val="center"/>
       </w:pPr>
       <w:r>
@@ -154,6 +166,7 @@
     </w:p>
     <w:p>
       <w:pPr>
+        <w:spacing w:line="360" w:lineRule="auto"/>
         <w:jc w:val="center"/>
       </w:pPr>
       <w:r>
@@ -167,6 +180,7 @@
     </w:p>
     <w:p>
       <w:pPr>
+        <w:spacing w:line="360" w:lineRule="auto"/>
         <w:jc w:val="center"/>
       </w:pPr>
       <w:r>
@@ -184,9 +198,26 @@
       </w:r>
     </w:p>
     <w:p>
+      <w:pPr>
+        <w:sectPr>
+          <w:headerReference w:type="default" r:id="rId9"/>
+          <w:footerReference w:type="default" r:id="rId10"/>
+          <w:pgSz w:w="12240" w:h="15840"/>
+          <w:pgMar w:top="1417" w:right="1417" w:bottom="1417" w:left="1701" w:header="850" w:footer="850" w:gutter="0"/>
+          <w:cols w:space="720"/>
+          <w:docGrid w:linePitch="360"/>
+        </w:sectPr>
+      </w:pPr>
+    </w:p>
+    <w:p>
+      <w:pPr>
+        <w:pStyle w:val="Heading1"/>
+        <w:spacing w:line="360" w:lineRule="auto"/>
+        <w:jc w:val="left"/>
+      </w:pPr>
       <w:r>
         <w:rPr>
-          <w:rFonts w:ascii="Times New Roman" w:hAnsi="Times New Roman" w:eastAsia="宋体"/>
+          <w:rFonts w:ascii="Times New Roman" w:hAnsi="Times New Roman" w:eastAsia="黑体"/>
           <w:b/>
           <w:sz w:val="32"/>
         </w:rPr>
@@ -194,6 +225,10 @@
       </w:r>
     </w:p>
     <w:p>
+      <w:pPr>
+        <w:spacing w:line="360" w:lineRule="auto"/>
+        <w:ind w:firstLine="420"/>
+      </w:pPr>
       <w:r>
         <w:rPr>
           <w:rFonts w:ascii="Times New Roman" w:hAnsi="Times New Roman" w:eastAsia="宋体"/>
@@ -204,16 +239,24 @@
       </w:r>
     </w:p>
     <w:p>
+      <w:pPr>
+        <w:spacing w:line="360" w:lineRule="auto"/>
+        <w:ind w:firstLine="420"/>
+      </w:pPr>
       <w:r>
         <w:rPr>
           <w:rFonts w:ascii="Times New Roman" w:hAnsi="Times New Roman" w:eastAsia="宋体"/>
           <w:b w:val="0"/>
           <w:sz w:val="24"/>
         </w:rPr>
-        <w:t>【摘要占位】本课题面向浙江科技学院校园服务场景，设计并实现了一套基于大模型与本地知识库的校园智能问答助手。系统围绕校园问答中信息分散、检索效率不足和回答自然度不高等问题，完成了知识库构建、查询改写、检索增强、结构化回答与模块化重构等核心功能设计。实验结果表明，该系统能够在图书馆开放时间、学籍管理、奖学金申请等典型校园问题上提供较为准确、自然且具有一定上下文理解能力的回答。该研究为校园服务智能化提供了一种可行实现方案。</w:t>
+        <w:t>【摘要占位】本课题面向浙江科技大学校园服务场景，设计并实现了一套基于大模型与本地知识库的校园智能问答助手。系统围绕校园问答中信息分散、检索效率不足和回答自然度不高等问题，完成了知识库构建、查询改写、检索增强、结构化回答与模块化重构等核心功能设计。实验结果表明，该系统能够在图书馆开放时间、学籍管理、奖学金申请等典型校园问题上提供较为准确、自然且具有一定上下文理解能力的回答。该研究为校园服务智能化提供了一种可行实现方案。</w:t>
       </w:r>
     </w:p>
     <w:p>
+      <w:pPr>
+        <w:spacing w:line="360" w:lineRule="auto"/>
+        <w:ind w:firstLine="420"/>
+      </w:pPr>
       <w:r>
         <w:rPr>
           <w:rFonts w:ascii="Times New Roman" w:hAnsi="Times New Roman" w:eastAsia="宋体"/>
@@ -229,9 +272,14 @@
       </w:r>
     </w:p>
     <w:p>
+      <w:pPr>
+        <w:pStyle w:val="Heading1"/>
+        <w:spacing w:line="360" w:lineRule="auto"/>
+        <w:jc w:val="left"/>
+      </w:pPr>
       <w:r>
         <w:rPr>
-          <w:rFonts w:ascii="Times New Roman" w:hAnsi="Times New Roman" w:eastAsia="宋体"/>
+          <w:rFonts w:ascii="Times New Roman" w:hAnsi="Times New Roman" w:eastAsia="黑体"/>
           <w:b/>
           <w:sz w:val="32"/>
         </w:rPr>
@@ -239,6 +287,10 @@
       </w:r>
     </w:p>
     <w:p>
+      <w:pPr>
+        <w:spacing w:line="360" w:lineRule="auto"/>
+        <w:ind w:firstLine="420"/>
+      </w:pPr>
       <w:r>
         <w:rPr>
           <w:rFonts w:ascii="Times New Roman" w:hAnsi="Times New Roman" w:eastAsia="宋体"/>
@@ -249,6 +301,10 @@
       </w:r>
     </w:p>
     <w:p>
+      <w:pPr>
+        <w:spacing w:line="360" w:lineRule="auto"/>
+        <w:ind w:firstLine="420"/>
+      </w:pPr>
       <w:r>
         <w:rPr>
           <w:rFonts w:ascii="Times New Roman" w:hAnsi="Times New Roman" w:eastAsia="宋体"/>
@@ -259,6 +315,10 @@
       </w:r>
     </w:p>
     <w:p>
+      <w:pPr>
+        <w:spacing w:line="360" w:lineRule="auto"/>
+        <w:ind w:firstLine="420"/>
+      </w:pPr>
       <w:r>
         <w:rPr>
           <w:rFonts w:ascii="Times New Roman" w:hAnsi="Times New Roman" w:eastAsia="宋体"/>
@@ -274,9 +334,14 @@
       </w:r>
     </w:p>
     <w:p>
+      <w:pPr>
+        <w:pStyle w:val="Heading1"/>
+        <w:spacing w:line="360" w:lineRule="auto"/>
+        <w:jc w:val="left"/>
+      </w:pPr>
       <w:r>
         <w:rPr>
-          <w:rFonts w:ascii="Times New Roman" w:hAnsi="Times New Roman" w:eastAsia="宋体"/>
+          <w:rFonts w:ascii="Times New Roman" w:hAnsi="Times New Roman" w:eastAsia="黑体"/>
           <w:b/>
           <w:sz w:val="32"/>
         </w:rPr>
@@ -284,133 +349,15 @@
       </w:r>
     </w:p>
     <w:p>
+      <w:pPr>
+        <w:spacing w:line="360" w:lineRule="auto"/>
+      </w:pPr>
       <w:r>
-        <w:rPr>
-          <w:rFonts w:ascii="Times New Roman" w:hAnsi="Times New Roman" w:eastAsia="宋体"/>
-          <w:b w:val="0"/>
-          <w:sz w:val="24"/>
-        </w:rPr>
-        <w:t>【目录生成提示】请在 Word 中使用“引用 -&gt; 目录 -&gt; 自动目录”生成，不要手工输入页码。目录应至少包含：中英文摘要、各章标题（最多到第三级标题）、致谢、参考文献、附录。</w:t>
-      </w:r>
-    </w:p>
-    <w:p>
-      <w:r>
-        <w:rPr>
-          <w:rFonts w:ascii="Times New Roman" w:hAnsi="Times New Roman" w:eastAsia="宋体"/>
-          <w:b w:val="0"/>
-          <w:sz w:val="24"/>
-        </w:rPr>
-        <w:t>摘要</w:t>
-      </w:r>
-    </w:p>
-    <w:p>
-      <w:r>
-        <w:rPr>
-          <w:rFonts w:ascii="Times New Roman" w:hAnsi="Times New Roman" w:eastAsia="宋体"/>
-          <w:b w:val="0"/>
-          <w:sz w:val="24"/>
-        </w:rPr>
-        <w:t>Abstract</w:t>
-      </w:r>
-    </w:p>
-    <w:p>
-      <w:r>
-        <w:rPr>
-          <w:rFonts w:ascii="Times New Roman" w:hAnsi="Times New Roman" w:eastAsia="宋体"/>
-          <w:b w:val="0"/>
-          <w:sz w:val="24"/>
-        </w:rPr>
-        <w:t>第1章 引言</w:t>
-      </w:r>
-    </w:p>
-    <w:p>
-      <w:r>
-        <w:rPr>
-          <w:rFonts w:ascii="Times New Roman" w:hAnsi="Times New Roman" w:eastAsia="宋体"/>
-          <w:b w:val="0"/>
-          <w:sz w:val="24"/>
-        </w:rPr>
-        <w:t>第2章 相关技术与理论基础</w:t>
-      </w:r>
-    </w:p>
-    <w:p>
-      <w:r>
-        <w:rPr>
-          <w:rFonts w:ascii="Times New Roman" w:hAnsi="Times New Roman" w:eastAsia="宋体"/>
-          <w:b w:val="0"/>
-          <w:sz w:val="24"/>
-        </w:rPr>
-        <w:t>第3章 需求分析</w:t>
-      </w:r>
-    </w:p>
-    <w:p>
-      <w:r>
-        <w:rPr>
-          <w:rFonts w:ascii="Times New Roman" w:hAnsi="Times New Roman" w:eastAsia="宋体"/>
-          <w:b w:val="0"/>
-          <w:sz w:val="24"/>
-        </w:rPr>
-        <w:t>第4章 系统总体设计</w:t>
-      </w:r>
-    </w:p>
-    <w:p>
-      <w:r>
-        <w:rPr>
-          <w:rFonts w:ascii="Times New Roman" w:hAnsi="Times New Roman" w:eastAsia="宋体"/>
-          <w:b w:val="0"/>
-          <w:sz w:val="24"/>
-        </w:rPr>
-        <w:t>第5章 系统详细设计与实现</w:t>
-      </w:r>
-    </w:p>
-    <w:p>
-      <w:r>
-        <w:rPr>
-          <w:rFonts w:ascii="Times New Roman" w:hAnsi="Times New Roman" w:eastAsia="宋体"/>
-          <w:b w:val="0"/>
-          <w:sz w:val="24"/>
-        </w:rPr>
-        <w:t>第6章 系统测试与结果分析</w:t>
-      </w:r>
-    </w:p>
-    <w:p>
-      <w:r>
-        <w:rPr>
-          <w:rFonts w:ascii="Times New Roman" w:hAnsi="Times New Roman" w:eastAsia="宋体"/>
-          <w:b w:val="0"/>
-          <w:sz w:val="24"/>
-        </w:rPr>
-        <w:t>第7章 结束语</w:t>
-      </w:r>
-    </w:p>
-    <w:p>
-      <w:r>
-        <w:rPr>
-          <w:rFonts w:ascii="Times New Roman" w:hAnsi="Times New Roman" w:eastAsia="宋体"/>
-          <w:b w:val="0"/>
-          <w:sz w:val="24"/>
-        </w:rPr>
-        <w:t>致谢</w:t>
-      </w:r>
-    </w:p>
-    <w:p>
-      <w:r>
-        <w:rPr>
-          <w:rFonts w:ascii="Times New Roman" w:hAnsi="Times New Roman" w:eastAsia="宋体"/>
-          <w:b w:val="0"/>
-          <w:sz w:val="24"/>
-        </w:rPr>
-        <w:t>参考文献</w:t>
-      </w:r>
-    </w:p>
-    <w:p>
-      <w:r>
-        <w:rPr>
-          <w:rFonts w:ascii="Times New Roman" w:hAnsi="Times New Roman" w:eastAsia="宋体"/>
-          <w:b w:val="0"/>
-          <w:sz w:val="24"/>
-        </w:rPr>
-        <w:t>附录1</w:t>
+        <w:fldChar w:fldCharType="begin"/>
+        <w:instrText xml:space="preserve">TOC \o "1-3" \h \z \u</w:instrText>
+        <w:fldChar w:fldCharType="separate"/>
+        <w:t>请在 Word 中右键目录并选择“更新域”，自动生成目录。</w:t>
+        <w:fldChar w:fldCharType="end"/>
       </w:r>
     </w:p>
     <w:p>
@@ -419,9 +366,27 @@
       </w:r>
     </w:p>
     <w:p>
+      <w:pPr>
+        <w:sectPr>
+          <w:headerReference w:type="default" r:id="rId11"/>
+          <w:footerReference w:type="default" r:id="rId12"/>
+          <w:pgSz w:w="12240" w:h="15840"/>
+          <w:pgMar w:top="1417" w:right="1417" w:bottom="1417" w:left="1701" w:header="850" w:footer="850" w:gutter="0"/>
+          <w:cols w:space="720"/>
+          <w:docGrid w:linePitch="360"/>
+          <w:pgNumType w:start="1" w:fmt="upperRoman"/>
+        </w:sectPr>
+      </w:pPr>
+    </w:p>
+    <w:p>
+      <w:pPr>
+        <w:pStyle w:val="Heading1"/>
+        <w:spacing w:line="360" w:lineRule="auto"/>
+        <w:jc w:val="left"/>
+      </w:pPr>
       <w:r>
         <w:rPr>
-          <w:rFonts w:ascii="Times New Roman" w:hAnsi="Times New Roman" w:eastAsia="宋体"/>
+          <w:rFonts w:ascii="Times New Roman" w:hAnsi="Times New Roman" w:eastAsia="黑体"/>
           <w:b/>
           <w:sz w:val="32"/>
         </w:rPr>
@@ -429,6 +394,10 @@
       </w:r>
     </w:p>
     <w:p>
+      <w:pPr>
+        <w:spacing w:line="360" w:lineRule="auto"/>
+        <w:ind w:firstLine="420"/>
+      </w:pPr>
       <w:r>
         <w:rPr>
           <w:rFonts w:ascii="Times New Roman" w:hAnsi="Times New Roman" w:eastAsia="宋体"/>
@@ -439,9 +408,14 @@
       </w:r>
     </w:p>
     <w:p>
+      <w:pPr>
+        <w:pStyle w:val="Heading2"/>
+        <w:spacing w:line="360" w:lineRule="auto"/>
+        <w:jc w:val="left"/>
+      </w:pPr>
       <w:r>
         <w:rPr>
-          <w:rFonts w:ascii="Times New Roman" w:hAnsi="Times New Roman" w:eastAsia="宋体"/>
+          <w:rFonts w:ascii="Times New Roman" w:hAnsi="Times New Roman" w:eastAsia="黑体"/>
           <w:b/>
           <w:sz w:val="28"/>
         </w:rPr>
@@ -449,6 +423,10 @@
       </w:r>
     </w:p>
     <w:p>
+      <w:pPr>
+        <w:spacing w:line="360" w:lineRule="auto"/>
+        <w:ind w:firstLine="420"/>
+      </w:pPr>
       <w:r>
         <w:rPr>
           <w:rFonts w:ascii="Times New Roman" w:hAnsi="Times New Roman" w:eastAsia="宋体"/>
@@ -459,9 +437,14 @@
       </w:r>
     </w:p>
     <w:p>
+      <w:pPr>
+        <w:pStyle w:val="Heading2"/>
+        <w:spacing w:line="360" w:lineRule="auto"/>
+        <w:jc w:val="left"/>
+      </w:pPr>
       <w:r>
         <w:rPr>
-          <w:rFonts w:ascii="Times New Roman" w:hAnsi="Times New Roman" w:eastAsia="宋体"/>
+          <w:rFonts w:ascii="Times New Roman" w:hAnsi="Times New Roman" w:eastAsia="黑体"/>
           <w:b/>
           <w:sz w:val="28"/>
         </w:rPr>
@@ -469,6 +452,10 @@
       </w:r>
     </w:p>
     <w:p>
+      <w:pPr>
+        <w:spacing w:line="360" w:lineRule="auto"/>
+        <w:ind w:firstLine="420"/>
+      </w:pPr>
       <w:r>
         <w:rPr>
           <w:rFonts w:ascii="Times New Roman" w:hAnsi="Times New Roman" w:eastAsia="宋体"/>
@@ -479,9 +466,14 @@
       </w:r>
     </w:p>
     <w:p>
+      <w:pPr>
+        <w:pStyle w:val="Heading2"/>
+        <w:spacing w:line="360" w:lineRule="auto"/>
+        <w:jc w:val="left"/>
+      </w:pPr>
       <w:r>
         <w:rPr>
-          <w:rFonts w:ascii="Times New Roman" w:hAnsi="Times New Roman" w:eastAsia="宋体"/>
+          <w:rFonts w:ascii="Times New Roman" w:hAnsi="Times New Roman" w:eastAsia="黑体"/>
           <w:b/>
           <w:sz w:val="28"/>
         </w:rPr>
@@ -489,6 +481,10 @@
       </w:r>
     </w:p>
     <w:p>
+      <w:pPr>
+        <w:spacing w:line="360" w:lineRule="auto"/>
+        <w:ind w:firstLine="420"/>
+      </w:pPr>
       <w:r>
         <w:rPr>
           <w:rFonts w:ascii="Times New Roman" w:hAnsi="Times New Roman" w:eastAsia="宋体"/>
@@ -499,9 +495,14 @@
       </w:r>
     </w:p>
     <w:p>
+      <w:pPr>
+        <w:pStyle w:val="Heading2"/>
+        <w:spacing w:line="360" w:lineRule="auto"/>
+        <w:jc w:val="left"/>
+      </w:pPr>
       <w:r>
         <w:rPr>
-          <w:rFonts w:ascii="Times New Roman" w:hAnsi="Times New Roman" w:eastAsia="宋体"/>
+          <w:rFonts w:ascii="Times New Roman" w:hAnsi="Times New Roman" w:eastAsia="黑体"/>
           <w:b/>
           <w:sz w:val="28"/>
         </w:rPr>
@@ -509,6 +510,10 @@
       </w:r>
     </w:p>
     <w:p>
+      <w:pPr>
+        <w:spacing w:line="360" w:lineRule="auto"/>
+        <w:ind w:firstLine="420"/>
+      </w:pPr>
       <w:r>
         <w:rPr>
           <w:rFonts w:ascii="Times New Roman" w:hAnsi="Times New Roman" w:eastAsia="宋体"/>
@@ -524,9 +529,14 @@
       </w:r>
     </w:p>
     <w:p>
+      <w:pPr>
+        <w:pStyle w:val="Heading1"/>
+        <w:spacing w:line="360" w:lineRule="auto"/>
+        <w:jc w:val="left"/>
+      </w:pPr>
       <w:r>
         <w:rPr>
-          <w:rFonts w:ascii="Times New Roman" w:hAnsi="Times New Roman" w:eastAsia="宋体"/>
+          <w:rFonts w:ascii="Times New Roman" w:hAnsi="Times New Roman" w:eastAsia="黑体"/>
           <w:b/>
           <w:sz w:val="32"/>
         </w:rPr>
@@ -534,6 +544,10 @@
       </w:r>
     </w:p>
     <w:p>
+      <w:pPr>
+        <w:spacing w:line="360" w:lineRule="auto"/>
+        <w:ind w:firstLine="420"/>
+      </w:pPr>
       <w:r>
         <w:rPr>
           <w:rFonts w:ascii="Times New Roman" w:hAnsi="Times New Roman" w:eastAsia="宋体"/>
@@ -544,9 +558,14 @@
       </w:r>
     </w:p>
     <w:p>
+      <w:pPr>
+        <w:pStyle w:val="Heading2"/>
+        <w:spacing w:line="360" w:lineRule="auto"/>
+        <w:jc w:val="left"/>
+      </w:pPr>
       <w:r>
         <w:rPr>
-          <w:rFonts w:ascii="Times New Roman" w:hAnsi="Times New Roman" w:eastAsia="宋体"/>
+          <w:rFonts w:ascii="Times New Roman" w:hAnsi="Times New Roman" w:eastAsia="黑体"/>
           <w:b/>
           <w:sz w:val="28"/>
         </w:rPr>
@@ -554,6 +573,10 @@
       </w:r>
     </w:p>
     <w:p>
+      <w:pPr>
+        <w:spacing w:line="360" w:lineRule="auto"/>
+        <w:ind w:firstLine="420"/>
+      </w:pPr>
       <w:r>
         <w:rPr>
           <w:rFonts w:ascii="Times New Roman" w:hAnsi="Times New Roman" w:eastAsia="宋体"/>
@@ -564,9 +587,14 @@
       </w:r>
     </w:p>
     <w:p>
+      <w:pPr>
+        <w:pStyle w:val="Heading2"/>
+        <w:spacing w:line="360" w:lineRule="auto"/>
+        <w:jc w:val="left"/>
+      </w:pPr>
       <w:r>
         <w:rPr>
-          <w:rFonts w:ascii="Times New Roman" w:hAnsi="Times New Roman" w:eastAsia="宋体"/>
+          <w:rFonts w:ascii="Times New Roman" w:hAnsi="Times New Roman" w:eastAsia="黑体"/>
           <w:b/>
           <w:sz w:val="28"/>
         </w:rPr>
@@ -574,6 +602,10 @@
       </w:r>
     </w:p>
     <w:p>
+      <w:pPr>
+        <w:spacing w:line="360" w:lineRule="auto"/>
+        <w:ind w:firstLine="420"/>
+      </w:pPr>
       <w:r>
         <w:rPr>
           <w:rFonts w:ascii="Times New Roman" w:hAnsi="Times New Roman" w:eastAsia="宋体"/>
@@ -584,9 +616,14 @@
       </w:r>
     </w:p>
     <w:p>
+      <w:pPr>
+        <w:pStyle w:val="Heading2"/>
+        <w:spacing w:line="360" w:lineRule="auto"/>
+        <w:jc w:val="left"/>
+      </w:pPr>
       <w:r>
         <w:rPr>
-          <w:rFonts w:ascii="Times New Roman" w:hAnsi="Times New Roman" w:eastAsia="宋体"/>
+          <w:rFonts w:ascii="Times New Roman" w:hAnsi="Times New Roman" w:eastAsia="黑体"/>
           <w:b/>
           <w:sz w:val="28"/>
         </w:rPr>
@@ -594,6 +631,10 @@
       </w:r>
     </w:p>
     <w:p>
+      <w:pPr>
+        <w:spacing w:line="360" w:lineRule="auto"/>
+        <w:ind w:firstLine="420"/>
+      </w:pPr>
       <w:r>
         <w:rPr>
           <w:rFonts w:ascii="Times New Roman" w:hAnsi="Times New Roman" w:eastAsia="宋体"/>
@@ -604,9 +645,14 @@
       </w:r>
     </w:p>
     <w:p>
+      <w:pPr>
+        <w:pStyle w:val="Heading2"/>
+        <w:spacing w:line="360" w:lineRule="auto"/>
+        <w:jc w:val="left"/>
+      </w:pPr>
       <w:r>
         <w:rPr>
-          <w:rFonts w:ascii="Times New Roman" w:hAnsi="Times New Roman" w:eastAsia="宋体"/>
+          <w:rFonts w:ascii="Times New Roman" w:hAnsi="Times New Roman" w:eastAsia="黑体"/>
           <w:b/>
           <w:sz w:val="28"/>
         </w:rPr>
@@ -614,6 +660,10 @@
       </w:r>
     </w:p>
     <w:p>
+      <w:pPr>
+        <w:spacing w:line="360" w:lineRule="auto"/>
+        <w:ind w:firstLine="420"/>
+      </w:pPr>
       <w:r>
         <w:rPr>
           <w:rFonts w:ascii="Times New Roman" w:hAnsi="Times New Roman" w:eastAsia="宋体"/>
@@ -629,9 +679,14 @@
       </w:r>
     </w:p>
     <w:p>
+      <w:pPr>
+        <w:pStyle w:val="Heading1"/>
+        <w:spacing w:line="360" w:lineRule="auto"/>
+        <w:jc w:val="left"/>
+      </w:pPr>
       <w:r>
         <w:rPr>
-          <w:rFonts w:ascii="Times New Roman" w:hAnsi="Times New Roman" w:eastAsia="宋体"/>
+          <w:rFonts w:ascii="Times New Roman" w:hAnsi="Times New Roman" w:eastAsia="黑体"/>
           <w:b/>
           <w:sz w:val="32"/>
         </w:rPr>
@@ -639,6 +694,10 @@
       </w:r>
     </w:p>
     <w:p>
+      <w:pPr>
+        <w:spacing w:line="360" w:lineRule="auto"/>
+        <w:ind w:firstLine="420"/>
+      </w:pPr>
       <w:r>
         <w:rPr>
           <w:rFonts w:ascii="Times New Roman" w:hAnsi="Times New Roman" w:eastAsia="宋体"/>
@@ -649,9 +708,14 @@
       </w:r>
     </w:p>
     <w:p>
+      <w:pPr>
+        <w:pStyle w:val="Heading2"/>
+        <w:spacing w:line="360" w:lineRule="auto"/>
+        <w:jc w:val="left"/>
+      </w:pPr>
       <w:r>
         <w:rPr>
-          <w:rFonts w:ascii="Times New Roman" w:hAnsi="Times New Roman" w:eastAsia="宋体"/>
+          <w:rFonts w:ascii="Times New Roman" w:hAnsi="Times New Roman" w:eastAsia="黑体"/>
           <w:b/>
           <w:sz w:val="28"/>
         </w:rPr>
@@ -659,6 +723,10 @@
       </w:r>
     </w:p>
     <w:p>
+      <w:pPr>
+        <w:spacing w:line="360" w:lineRule="auto"/>
+        <w:ind w:firstLine="420"/>
+      </w:pPr>
       <w:r>
         <w:rPr>
           <w:rFonts w:ascii="Times New Roman" w:hAnsi="Times New Roman" w:eastAsia="宋体"/>
@@ -669,9 +737,14 @@
       </w:r>
     </w:p>
     <w:p>
+      <w:pPr>
+        <w:pStyle w:val="Heading2"/>
+        <w:spacing w:line="360" w:lineRule="auto"/>
+        <w:jc w:val="left"/>
+      </w:pPr>
       <w:r>
         <w:rPr>
-          <w:rFonts w:ascii="Times New Roman" w:hAnsi="Times New Roman" w:eastAsia="宋体"/>
+          <w:rFonts w:ascii="Times New Roman" w:hAnsi="Times New Roman" w:eastAsia="黑体"/>
           <w:b/>
           <w:sz w:val="28"/>
         </w:rPr>
@@ -679,6 +752,10 @@
       </w:r>
     </w:p>
     <w:p>
+      <w:pPr>
+        <w:spacing w:line="360" w:lineRule="auto"/>
+        <w:ind w:firstLine="420"/>
+      </w:pPr>
       <w:r>
         <w:rPr>
           <w:rFonts w:ascii="Times New Roman" w:hAnsi="Times New Roman" w:eastAsia="宋体"/>
@@ -689,9 +766,14 @@
       </w:r>
     </w:p>
     <w:p>
+      <w:pPr>
+        <w:pStyle w:val="Heading2"/>
+        <w:spacing w:line="360" w:lineRule="auto"/>
+        <w:jc w:val="left"/>
+      </w:pPr>
       <w:r>
         <w:rPr>
-          <w:rFonts w:ascii="Times New Roman" w:hAnsi="Times New Roman" w:eastAsia="宋体"/>
+          <w:rFonts w:ascii="Times New Roman" w:hAnsi="Times New Roman" w:eastAsia="黑体"/>
           <w:b/>
           <w:sz w:val="28"/>
         </w:rPr>
@@ -699,6 +781,10 @@
       </w:r>
     </w:p>
     <w:p>
+      <w:pPr>
+        <w:spacing w:line="360" w:lineRule="auto"/>
+        <w:ind w:firstLine="420"/>
+      </w:pPr>
       <w:r>
         <w:rPr>
           <w:rFonts w:ascii="Times New Roman" w:hAnsi="Times New Roman" w:eastAsia="宋体"/>
@@ -709,9 +795,14 @@
       </w:r>
     </w:p>
     <w:p>
+      <w:pPr>
+        <w:pStyle w:val="Heading2"/>
+        <w:spacing w:line="360" w:lineRule="auto"/>
+        <w:jc w:val="left"/>
+      </w:pPr>
       <w:r>
         <w:rPr>
-          <w:rFonts w:ascii="Times New Roman" w:hAnsi="Times New Roman" w:eastAsia="宋体"/>
+          <w:rFonts w:ascii="Times New Roman" w:hAnsi="Times New Roman" w:eastAsia="黑体"/>
           <w:b/>
           <w:sz w:val="28"/>
         </w:rPr>
@@ -719,6 +810,10 @@
       </w:r>
     </w:p>
     <w:p>
+      <w:pPr>
+        <w:spacing w:line="360" w:lineRule="auto"/>
+        <w:ind w:firstLine="420"/>
+      </w:pPr>
       <w:r>
         <w:rPr>
           <w:rFonts w:ascii="Times New Roman" w:hAnsi="Times New Roman" w:eastAsia="宋体"/>
@@ -734,9 +829,14 @@
       </w:r>
     </w:p>
     <w:p>
+      <w:pPr>
+        <w:pStyle w:val="Heading1"/>
+        <w:spacing w:line="360" w:lineRule="auto"/>
+        <w:jc w:val="left"/>
+      </w:pPr>
       <w:r>
         <w:rPr>
-          <w:rFonts w:ascii="Times New Roman" w:hAnsi="Times New Roman" w:eastAsia="宋体"/>
+          <w:rFonts w:ascii="Times New Roman" w:hAnsi="Times New Roman" w:eastAsia="黑体"/>
           <w:b/>
           <w:sz w:val="32"/>
         </w:rPr>
@@ -744,6 +844,10 @@
       </w:r>
     </w:p>
     <w:p>
+      <w:pPr>
+        <w:spacing w:line="360" w:lineRule="auto"/>
+        <w:ind w:firstLine="420"/>
+      </w:pPr>
       <w:r>
         <w:rPr>
           <w:rFonts w:ascii="Times New Roman" w:hAnsi="Times New Roman" w:eastAsia="宋体"/>
@@ -754,9 +858,14 @@
       </w:r>
     </w:p>
     <w:p>
+      <w:pPr>
+        <w:pStyle w:val="Heading2"/>
+        <w:spacing w:line="360" w:lineRule="auto"/>
+        <w:jc w:val="left"/>
+      </w:pPr>
       <w:r>
         <w:rPr>
-          <w:rFonts w:ascii="Times New Roman" w:hAnsi="Times New Roman" w:eastAsia="宋体"/>
+          <w:rFonts w:ascii="Times New Roman" w:hAnsi="Times New Roman" w:eastAsia="黑体"/>
           <w:b/>
           <w:sz w:val="28"/>
         </w:rPr>
@@ -764,6 +873,10 @@
       </w:r>
     </w:p>
     <w:p>
+      <w:pPr>
+        <w:spacing w:line="360" w:lineRule="auto"/>
+        <w:ind w:firstLine="420"/>
+      </w:pPr>
       <w:r>
         <w:rPr>
           <w:rFonts w:ascii="Times New Roman" w:hAnsi="Times New Roman" w:eastAsia="宋体"/>
@@ -774,9 +887,14 @@
       </w:r>
     </w:p>
     <w:p>
+      <w:pPr>
+        <w:pStyle w:val="Heading2"/>
+        <w:spacing w:line="360" w:lineRule="auto"/>
+        <w:jc w:val="left"/>
+      </w:pPr>
       <w:r>
         <w:rPr>
-          <w:rFonts w:ascii="Times New Roman" w:hAnsi="Times New Roman" w:eastAsia="宋体"/>
+          <w:rFonts w:ascii="Times New Roman" w:hAnsi="Times New Roman" w:eastAsia="黑体"/>
           <w:b/>
           <w:sz w:val="28"/>
         </w:rPr>
@@ -784,6 +902,10 @@
       </w:r>
     </w:p>
     <w:p>
+      <w:pPr>
+        <w:spacing w:line="360" w:lineRule="auto"/>
+        <w:ind w:firstLine="420"/>
+      </w:pPr>
       <w:r>
         <w:rPr>
           <w:rFonts w:ascii="Times New Roman" w:hAnsi="Times New Roman" w:eastAsia="宋体"/>
@@ -794,9 +916,14 @@
       </w:r>
     </w:p>
     <w:p>
+      <w:pPr>
+        <w:pStyle w:val="Heading2"/>
+        <w:spacing w:line="360" w:lineRule="auto"/>
+        <w:jc w:val="left"/>
+      </w:pPr>
       <w:r>
         <w:rPr>
-          <w:rFonts w:ascii="Times New Roman" w:hAnsi="Times New Roman" w:eastAsia="宋体"/>
+          <w:rFonts w:ascii="Times New Roman" w:hAnsi="Times New Roman" w:eastAsia="黑体"/>
           <w:b/>
           <w:sz w:val="28"/>
         </w:rPr>
@@ -804,6 +931,10 @@
       </w:r>
     </w:p>
     <w:p>
+      <w:pPr>
+        <w:spacing w:line="360" w:lineRule="auto"/>
+        <w:ind w:firstLine="420"/>
+      </w:pPr>
       <w:r>
         <w:rPr>
           <w:rFonts w:ascii="Times New Roman" w:hAnsi="Times New Roman" w:eastAsia="宋体"/>
@@ -814,9 +945,14 @@
       </w:r>
     </w:p>
     <w:p>
+      <w:pPr>
+        <w:pStyle w:val="Heading2"/>
+        <w:spacing w:line="360" w:lineRule="auto"/>
+        <w:jc w:val="left"/>
+      </w:pPr>
       <w:r>
         <w:rPr>
-          <w:rFonts w:ascii="Times New Roman" w:hAnsi="Times New Roman" w:eastAsia="宋体"/>
+          <w:rFonts w:ascii="Times New Roman" w:hAnsi="Times New Roman" w:eastAsia="黑体"/>
           <w:b/>
           <w:sz w:val="28"/>
         </w:rPr>
@@ -824,6 +960,10 @@
       </w:r>
     </w:p>
     <w:p>
+      <w:pPr>
+        <w:spacing w:line="360" w:lineRule="auto"/>
+        <w:ind w:firstLine="420"/>
+      </w:pPr>
       <w:r>
         <w:rPr>
           <w:rFonts w:ascii="Times New Roman" w:hAnsi="Times New Roman" w:eastAsia="宋体"/>
@@ -839,9 +979,14 @@
       </w:r>
     </w:p>
     <w:p>
+      <w:pPr>
+        <w:pStyle w:val="Heading1"/>
+        <w:spacing w:line="360" w:lineRule="auto"/>
+        <w:jc w:val="left"/>
+      </w:pPr>
       <w:r>
         <w:rPr>
-          <w:rFonts w:ascii="Times New Roman" w:hAnsi="Times New Roman" w:eastAsia="宋体"/>
+          <w:rFonts w:ascii="Times New Roman" w:hAnsi="Times New Roman" w:eastAsia="黑体"/>
           <w:b/>
           <w:sz w:val="32"/>
         </w:rPr>
@@ -849,6 +994,10 @@
       </w:r>
     </w:p>
     <w:p>
+      <w:pPr>
+        <w:spacing w:line="360" w:lineRule="auto"/>
+        <w:ind w:firstLine="420"/>
+      </w:pPr>
       <w:r>
         <w:rPr>
           <w:rFonts w:ascii="Times New Roman" w:hAnsi="Times New Roman" w:eastAsia="宋体"/>
@@ -859,9 +1008,14 @@
       </w:r>
     </w:p>
     <w:p>
+      <w:pPr>
+        <w:pStyle w:val="Heading2"/>
+        <w:spacing w:line="360" w:lineRule="auto"/>
+        <w:jc w:val="left"/>
+      </w:pPr>
       <w:r>
         <w:rPr>
-          <w:rFonts w:ascii="Times New Roman" w:hAnsi="Times New Roman" w:eastAsia="宋体"/>
+          <w:rFonts w:ascii="Times New Roman" w:hAnsi="Times New Roman" w:eastAsia="黑体"/>
           <w:b/>
           <w:sz w:val="28"/>
         </w:rPr>
@@ -869,6 +1023,10 @@
       </w:r>
     </w:p>
     <w:p>
+      <w:pPr>
+        <w:spacing w:line="360" w:lineRule="auto"/>
+        <w:ind w:firstLine="420"/>
+      </w:pPr>
       <w:r>
         <w:rPr>
           <w:rFonts w:ascii="Times New Roman" w:hAnsi="Times New Roman" w:eastAsia="宋体"/>
@@ -879,9 +1037,14 @@
       </w:r>
     </w:p>
     <w:p>
+      <w:pPr>
+        <w:pStyle w:val="Heading2"/>
+        <w:spacing w:line="360" w:lineRule="auto"/>
+        <w:jc w:val="left"/>
+      </w:pPr>
       <w:r>
         <w:rPr>
-          <w:rFonts w:ascii="Times New Roman" w:hAnsi="Times New Roman" w:eastAsia="宋体"/>
+          <w:rFonts w:ascii="Times New Roman" w:hAnsi="Times New Roman" w:eastAsia="黑体"/>
           <w:b/>
           <w:sz w:val="28"/>
         </w:rPr>
@@ -889,6 +1052,10 @@
       </w:r>
     </w:p>
     <w:p>
+      <w:pPr>
+        <w:spacing w:line="360" w:lineRule="auto"/>
+        <w:ind w:firstLine="420"/>
+      </w:pPr>
       <w:r>
         <w:rPr>
           <w:rFonts w:ascii="Times New Roman" w:hAnsi="Times New Roman" w:eastAsia="宋体"/>
@@ -899,9 +1066,14 @@
       </w:r>
     </w:p>
     <w:p>
+      <w:pPr>
+        <w:pStyle w:val="Heading2"/>
+        <w:spacing w:line="360" w:lineRule="auto"/>
+        <w:jc w:val="left"/>
+      </w:pPr>
       <w:r>
         <w:rPr>
-          <w:rFonts w:ascii="Times New Roman" w:hAnsi="Times New Roman" w:eastAsia="宋体"/>
+          <w:rFonts w:ascii="Times New Roman" w:hAnsi="Times New Roman" w:eastAsia="黑体"/>
           <w:b/>
           <w:sz w:val="28"/>
         </w:rPr>
@@ -909,6 +1081,10 @@
       </w:r>
     </w:p>
     <w:p>
+      <w:pPr>
+        <w:spacing w:line="360" w:lineRule="auto"/>
+        <w:ind w:firstLine="420"/>
+      </w:pPr>
       <w:r>
         <w:rPr>
           <w:rFonts w:ascii="Times New Roman" w:hAnsi="Times New Roman" w:eastAsia="宋体"/>
@@ -919,9 +1095,14 @@
       </w:r>
     </w:p>
     <w:p>
+      <w:pPr>
+        <w:pStyle w:val="Heading2"/>
+        <w:spacing w:line="360" w:lineRule="auto"/>
+        <w:jc w:val="left"/>
+      </w:pPr>
       <w:r>
         <w:rPr>
-          <w:rFonts w:ascii="Times New Roman" w:hAnsi="Times New Roman" w:eastAsia="宋体"/>
+          <w:rFonts w:ascii="Times New Roman" w:hAnsi="Times New Roman" w:eastAsia="黑体"/>
           <w:b/>
           <w:sz w:val="28"/>
         </w:rPr>
@@ -929,6 +1110,10 @@
       </w:r>
     </w:p>
     <w:p>
+      <w:pPr>
+        <w:spacing w:line="360" w:lineRule="auto"/>
+        <w:ind w:firstLine="420"/>
+      </w:pPr>
       <w:r>
         <w:rPr>
           <w:rFonts w:ascii="Times New Roman" w:hAnsi="Times New Roman" w:eastAsia="宋体"/>
@@ -939,9 +1124,14 @@
       </w:r>
     </w:p>
     <w:p>
+      <w:pPr>
+        <w:pStyle w:val="Heading2"/>
+        <w:spacing w:line="360" w:lineRule="auto"/>
+        <w:jc w:val="left"/>
+      </w:pPr>
       <w:r>
         <w:rPr>
-          <w:rFonts w:ascii="Times New Roman" w:hAnsi="Times New Roman" w:eastAsia="宋体"/>
+          <w:rFonts w:ascii="Times New Roman" w:hAnsi="Times New Roman" w:eastAsia="黑体"/>
           <w:b/>
           <w:sz w:val="28"/>
         </w:rPr>
@@ -949,6 +1139,10 @@
       </w:r>
     </w:p>
     <w:p>
+      <w:pPr>
+        <w:spacing w:line="360" w:lineRule="auto"/>
+        <w:ind w:firstLine="420"/>
+      </w:pPr>
       <w:r>
         <w:rPr>
           <w:rFonts w:ascii="Times New Roman" w:hAnsi="Times New Roman" w:eastAsia="宋体"/>
@@ -964,9 +1158,14 @@
       </w:r>
     </w:p>
     <w:p>
+      <w:pPr>
+        <w:pStyle w:val="Heading1"/>
+        <w:spacing w:line="360" w:lineRule="auto"/>
+        <w:jc w:val="left"/>
+      </w:pPr>
       <w:r>
         <w:rPr>
-          <w:rFonts w:ascii="Times New Roman" w:hAnsi="Times New Roman" w:eastAsia="宋体"/>
+          <w:rFonts w:ascii="Times New Roman" w:hAnsi="Times New Roman" w:eastAsia="黑体"/>
           <w:b/>
           <w:sz w:val="32"/>
         </w:rPr>
@@ -974,6 +1173,10 @@
       </w:r>
     </w:p>
     <w:p>
+      <w:pPr>
+        <w:spacing w:line="360" w:lineRule="auto"/>
+        <w:ind w:firstLine="420"/>
+      </w:pPr>
       <w:r>
         <w:rPr>
           <w:rFonts w:ascii="Times New Roman" w:hAnsi="Times New Roman" w:eastAsia="宋体"/>
@@ -984,9 +1187,14 @@
       </w:r>
     </w:p>
     <w:p>
+      <w:pPr>
+        <w:pStyle w:val="Heading2"/>
+        <w:spacing w:line="360" w:lineRule="auto"/>
+        <w:jc w:val="left"/>
+      </w:pPr>
       <w:r>
         <w:rPr>
-          <w:rFonts w:ascii="Times New Roman" w:hAnsi="Times New Roman" w:eastAsia="宋体"/>
+          <w:rFonts w:ascii="Times New Roman" w:hAnsi="Times New Roman" w:eastAsia="黑体"/>
           <w:b/>
           <w:sz w:val="28"/>
         </w:rPr>
@@ -994,6 +1202,10 @@
       </w:r>
     </w:p>
     <w:p>
+      <w:pPr>
+        <w:spacing w:line="360" w:lineRule="auto"/>
+        <w:ind w:firstLine="420"/>
+      </w:pPr>
       <w:r>
         <w:rPr>
           <w:rFonts w:ascii="Times New Roman" w:hAnsi="Times New Roman" w:eastAsia="宋体"/>
@@ -1004,9 +1216,14 @@
       </w:r>
     </w:p>
     <w:p>
+      <w:pPr>
+        <w:pStyle w:val="Heading2"/>
+        <w:spacing w:line="360" w:lineRule="auto"/>
+        <w:jc w:val="left"/>
+      </w:pPr>
       <w:r>
         <w:rPr>
-          <w:rFonts w:ascii="Times New Roman" w:hAnsi="Times New Roman" w:eastAsia="宋体"/>
+          <w:rFonts w:ascii="Times New Roman" w:hAnsi="Times New Roman" w:eastAsia="黑体"/>
           <w:b/>
           <w:sz w:val="28"/>
         </w:rPr>
@@ -1014,6 +1231,10 @@
       </w:r>
     </w:p>
     <w:p>
+      <w:pPr>
+        <w:spacing w:line="360" w:lineRule="auto"/>
+        <w:ind w:firstLine="420"/>
+      </w:pPr>
       <w:r>
         <w:rPr>
           <w:rFonts w:ascii="Times New Roman" w:hAnsi="Times New Roman" w:eastAsia="宋体"/>
@@ -1024,9 +1245,14 @@
       </w:r>
     </w:p>
     <w:p>
+      <w:pPr>
+        <w:pStyle w:val="Heading2"/>
+        <w:spacing w:line="360" w:lineRule="auto"/>
+        <w:jc w:val="left"/>
+      </w:pPr>
       <w:r>
         <w:rPr>
-          <w:rFonts w:ascii="Times New Roman" w:hAnsi="Times New Roman" w:eastAsia="宋体"/>
+          <w:rFonts w:ascii="Times New Roman" w:hAnsi="Times New Roman" w:eastAsia="黑体"/>
           <w:b/>
           <w:sz w:val="28"/>
         </w:rPr>
@@ -1034,6 +1260,10 @@
       </w:r>
     </w:p>
     <w:p>
+      <w:pPr>
+        <w:spacing w:line="360" w:lineRule="auto"/>
+        <w:ind w:firstLine="420"/>
+      </w:pPr>
       <w:r>
         <w:rPr>
           <w:rFonts w:ascii="Times New Roman" w:hAnsi="Times New Roman" w:eastAsia="宋体"/>
@@ -1044,9 +1274,14 @@
       </w:r>
     </w:p>
     <w:p>
+      <w:pPr>
+        <w:pStyle w:val="Heading2"/>
+        <w:spacing w:line="360" w:lineRule="auto"/>
+        <w:jc w:val="left"/>
+      </w:pPr>
       <w:r>
         <w:rPr>
-          <w:rFonts w:ascii="Times New Roman" w:hAnsi="Times New Roman" w:eastAsia="宋体"/>
+          <w:rFonts w:ascii="Times New Roman" w:hAnsi="Times New Roman" w:eastAsia="黑体"/>
           <w:b/>
           <w:sz w:val="28"/>
         </w:rPr>
@@ -1054,6 +1289,10 @@
       </w:r>
     </w:p>
     <w:p>
+      <w:pPr>
+        <w:spacing w:line="360" w:lineRule="auto"/>
+        <w:ind w:firstLine="420"/>
+      </w:pPr>
       <w:r>
         <w:rPr>
           <w:rFonts w:ascii="Times New Roman" w:hAnsi="Times New Roman" w:eastAsia="宋体"/>
@@ -1069,9 +1308,14 @@
       </w:r>
     </w:p>
     <w:p>
+      <w:pPr>
+        <w:pStyle w:val="Heading1"/>
+        <w:spacing w:line="360" w:lineRule="auto"/>
+        <w:jc w:val="left"/>
+      </w:pPr>
       <w:r>
         <w:rPr>
-          <w:rFonts w:ascii="Times New Roman" w:hAnsi="Times New Roman" w:eastAsia="宋体"/>
+          <w:rFonts w:ascii="Times New Roman" w:hAnsi="Times New Roman" w:eastAsia="黑体"/>
           <w:b/>
           <w:sz w:val="32"/>
         </w:rPr>
@@ -1079,6 +1323,10 @@
       </w:r>
     </w:p>
     <w:p>
+      <w:pPr>
+        <w:spacing w:line="360" w:lineRule="auto"/>
+        <w:ind w:firstLine="420"/>
+      </w:pPr>
       <w:r>
         <w:rPr>
           <w:rFonts w:ascii="Times New Roman" w:hAnsi="Times New Roman" w:eastAsia="宋体"/>
@@ -1089,9 +1337,14 @@
       </w:r>
     </w:p>
     <w:p>
+      <w:pPr>
+        <w:pStyle w:val="Heading2"/>
+        <w:spacing w:line="360" w:lineRule="auto"/>
+        <w:jc w:val="left"/>
+      </w:pPr>
       <w:r>
         <w:rPr>
-          <w:rFonts w:ascii="Times New Roman" w:hAnsi="Times New Roman" w:eastAsia="宋体"/>
+          <w:rFonts w:ascii="Times New Roman" w:hAnsi="Times New Roman" w:eastAsia="黑体"/>
           <w:b/>
           <w:sz w:val="28"/>
         </w:rPr>
@@ -1099,6 +1352,10 @@
       </w:r>
     </w:p>
     <w:p>
+      <w:pPr>
+        <w:spacing w:line="360" w:lineRule="auto"/>
+        <w:ind w:firstLine="420"/>
+      </w:pPr>
       <w:r>
         <w:rPr>
           <w:rFonts w:ascii="Times New Roman" w:hAnsi="Times New Roman" w:eastAsia="宋体"/>
@@ -1109,9 +1366,14 @@
       </w:r>
     </w:p>
     <w:p>
+      <w:pPr>
+        <w:pStyle w:val="Heading2"/>
+        <w:spacing w:line="360" w:lineRule="auto"/>
+        <w:jc w:val="left"/>
+      </w:pPr>
       <w:r>
         <w:rPr>
-          <w:rFonts w:ascii="Times New Roman" w:hAnsi="Times New Roman" w:eastAsia="宋体"/>
+          <w:rFonts w:ascii="Times New Roman" w:hAnsi="Times New Roman" w:eastAsia="黑体"/>
           <w:b/>
           <w:sz w:val="28"/>
         </w:rPr>
@@ -1119,6 +1381,10 @@
       </w:r>
     </w:p>
     <w:p>
+      <w:pPr>
+        <w:spacing w:line="360" w:lineRule="auto"/>
+        <w:ind w:firstLine="420"/>
+      </w:pPr>
       <w:r>
         <w:rPr>
           <w:rFonts w:ascii="Times New Roman" w:hAnsi="Times New Roman" w:eastAsia="宋体"/>
@@ -1129,9 +1395,14 @@
       </w:r>
     </w:p>
     <w:p>
+      <w:pPr>
+        <w:pStyle w:val="Heading2"/>
+        <w:spacing w:line="360" w:lineRule="auto"/>
+        <w:jc w:val="left"/>
+      </w:pPr>
       <w:r>
         <w:rPr>
-          <w:rFonts w:ascii="Times New Roman" w:hAnsi="Times New Roman" w:eastAsia="宋体"/>
+          <w:rFonts w:ascii="Times New Roman" w:hAnsi="Times New Roman" w:eastAsia="黑体"/>
           <w:b/>
           <w:sz w:val="28"/>
         </w:rPr>
@@ -1139,6 +1410,10 @@
       </w:r>
     </w:p>
     <w:p>
+      <w:pPr>
+        <w:spacing w:line="360" w:lineRule="auto"/>
+        <w:ind w:firstLine="420"/>
+      </w:pPr>
       <w:r>
         <w:rPr>
           <w:rFonts w:ascii="Times New Roman" w:hAnsi="Times New Roman" w:eastAsia="宋体"/>
@@ -1154,9 +1429,14 @@
       </w:r>
     </w:p>
     <w:p>
+      <w:pPr>
+        <w:pStyle w:val="Heading1"/>
+        <w:spacing w:line="360" w:lineRule="auto"/>
+        <w:jc w:val="left"/>
+      </w:pPr>
       <w:r>
         <w:rPr>
-          <w:rFonts w:ascii="Times New Roman" w:hAnsi="Times New Roman" w:eastAsia="宋体"/>
+          <w:rFonts w:ascii="Times New Roman" w:hAnsi="Times New Roman" w:eastAsia="黑体"/>
           <w:b/>
           <w:sz w:val="32"/>
         </w:rPr>
@@ -1164,6 +1444,10 @@
       </w:r>
     </w:p>
     <w:p>
+      <w:pPr>
+        <w:spacing w:line="360" w:lineRule="auto"/>
+        <w:ind w:firstLine="420"/>
+      </w:pPr>
       <w:r>
         <w:rPr>
           <w:rFonts w:ascii="Times New Roman" w:hAnsi="Times New Roman" w:eastAsia="宋体"/>
@@ -1179,9 +1463,14 @@
       </w:r>
     </w:p>
     <w:p>
+      <w:pPr>
+        <w:pStyle w:val="Heading1"/>
+        <w:spacing w:line="360" w:lineRule="auto"/>
+        <w:jc w:val="left"/>
+      </w:pPr>
       <w:r>
         <w:rPr>
-          <w:rFonts w:ascii="Times New Roman" w:hAnsi="Times New Roman" w:eastAsia="宋体"/>
+          <w:rFonts w:ascii="Times New Roman" w:hAnsi="Times New Roman" w:eastAsia="黑体"/>
           <w:b/>
           <w:sz w:val="32"/>
         </w:rPr>
@@ -1189,6 +1478,10 @@
       </w:r>
     </w:p>
     <w:p>
+      <w:pPr>
+        <w:spacing w:line="360" w:lineRule="auto"/>
+        <w:ind w:firstLine="420"/>
+      </w:pPr>
       <w:r>
         <w:rPr>
           <w:rFonts w:ascii="Times New Roman" w:hAnsi="Times New Roman" w:eastAsia="宋体"/>
@@ -1199,6 +1492,10 @@
       </w:r>
     </w:p>
     <w:p>
+      <w:pPr>
+        <w:spacing w:line="360" w:lineRule="auto"/>
+        <w:ind w:firstLine="420"/>
+      </w:pPr>
       <w:r>
         <w:rPr>
           <w:rFonts w:ascii="Times New Roman" w:hAnsi="Times New Roman" w:eastAsia="宋体"/>
@@ -1209,6 +1506,10 @@
       </w:r>
     </w:p>
     <w:p>
+      <w:pPr>
+        <w:spacing w:line="360" w:lineRule="auto"/>
+        <w:ind w:firstLine="420"/>
+      </w:pPr>
       <w:r>
         <w:rPr>
           <w:rFonts w:ascii="Times New Roman" w:hAnsi="Times New Roman" w:eastAsia="宋体"/>
@@ -1219,6 +1520,10 @@
       </w:r>
     </w:p>
     <w:p>
+      <w:pPr>
+        <w:spacing w:line="360" w:lineRule="auto"/>
+        <w:ind w:firstLine="420"/>
+      </w:pPr>
       <w:r>
         <w:rPr>
           <w:rFonts w:ascii="Times New Roman" w:hAnsi="Times New Roman" w:eastAsia="宋体"/>
@@ -1229,6 +1534,10 @@
       </w:r>
     </w:p>
     <w:p>
+      <w:pPr>
+        <w:spacing w:line="360" w:lineRule="auto"/>
+        <w:ind w:firstLine="420"/>
+      </w:pPr>
       <w:r>
         <w:rPr>
           <w:rFonts w:ascii="Times New Roman" w:hAnsi="Times New Roman" w:eastAsia="宋体"/>
@@ -1244,9 +1553,14 @@
       </w:r>
     </w:p>
     <w:p>
+      <w:pPr>
+        <w:pStyle w:val="Heading1"/>
+        <w:spacing w:line="360" w:lineRule="auto"/>
+        <w:jc w:val="left"/>
+      </w:pPr>
       <w:r>
         <w:rPr>
-          <w:rFonts w:ascii="Times New Roman" w:hAnsi="Times New Roman" w:eastAsia="宋体"/>
+          <w:rFonts w:ascii="Times New Roman" w:hAnsi="Times New Roman" w:eastAsia="黑体"/>
           <w:b/>
           <w:sz w:val="32"/>
         </w:rPr>
@@ -1254,6 +1568,10 @@
       </w:r>
     </w:p>
     <w:p>
+      <w:pPr>
+        <w:spacing w:line="360" w:lineRule="auto"/>
+        <w:ind w:firstLine="420"/>
+      </w:pPr>
       <w:r>
         <w:rPr>
           <w:rFonts w:ascii="Times New Roman" w:hAnsi="Times New Roman" w:eastAsia="宋体"/>
@@ -1269,9 +1587,14 @@
       </w:r>
     </w:p>
     <w:p>
+      <w:pPr>
+        <w:pStyle w:val="Heading1"/>
+        <w:spacing w:line="360" w:lineRule="auto"/>
+        <w:jc w:val="left"/>
+      </w:pPr>
       <w:r>
         <w:rPr>
-          <w:rFonts w:ascii="Times New Roman" w:hAnsi="Times New Roman" w:eastAsia="宋体"/>
+          <w:rFonts w:ascii="Times New Roman" w:hAnsi="Times New Roman" w:eastAsia="黑体"/>
           <w:b/>
           <w:sz w:val="32"/>
         </w:rPr>
@@ -1279,6 +1602,10 @@
       </w:r>
     </w:p>
     <w:p>
+      <w:pPr>
+        <w:spacing w:line="360" w:lineRule="auto"/>
+        <w:ind w:firstLine="420"/>
+      </w:pPr>
       <w:r>
         <w:rPr>
           <w:rFonts w:ascii="Times New Roman" w:hAnsi="Times New Roman" w:eastAsia="宋体"/>
@@ -1289,13 +1616,150 @@
       </w:r>
     </w:p>
     <w:sectPr>
+      <w:headerReference w:type="default" r:id="rId13"/>
+      <w:footerReference w:type="default" r:id="rId14"/>
       <w:pgSz w:w="12240" w:h="15840"/>
-      <w:pgMar w:top="1440" w:right="1800" w:bottom="1440" w:left="1800" w:header="720" w:footer="720" w:gutter="0"/>
+      <w:pgMar w:top="1417" w:right="1417" w:bottom="1417" w:left="1701" w:header="850" w:footer="850" w:gutter="0"/>
       <w:cols w:space="720"/>
       <w:docGrid w:linePitch="360"/>
+      <w:pgNumType w:start="1" w:fmt="decimal"/>
     </w:sectPr>
   </w:body>
 </w:document>
+</file>
+
+<file path=word/footer1.xml><?xml version="1.0" encoding="utf-8"?>
+<w:ftr xmlns:m="http://schemas.openxmlformats.org/officeDocument/2006/math" xmlns:mc="http://schemas.openxmlformats.org/markup-compatibility/2006" xmlns:mo="http://schemas.microsoft.com/office/mac/office/2008/main" xmlns:mv="urn:schemas-microsoft-com:mac:vml" xmlns:o="urn:schemas-microsoft-com:office:office" xmlns:r="http://schemas.openxmlformats.org/officeDocument/2006/relationships" xmlns:v="urn:schemas-microsoft-com:vml" xmlns:w10="urn:schemas-microsoft-com:office:word" xmlns:w14="http://schemas.microsoft.com/office/word/2010/wordml" xmlns:w="http://schemas.openxmlformats.org/wordprocessingml/2006/main" xmlns:wne="http://schemas.microsoft.com/office/word/2006/wordml" xmlns:wp14="http://schemas.microsoft.com/office/word/2010/wordprocessingDrawing" xmlns:wp="http://schemas.openxmlformats.org/drawingml/2006/wordprocessingDrawing" xmlns:wpc="http://schemas.microsoft.com/office/word/2010/wordprocessingCanvas" xmlns:wpg="http://schemas.microsoft.com/office/word/2010/wordprocessingGroup" xmlns:wpi="http://schemas.microsoft.com/office/word/2010/wordprocessingInk" xmlns:wps="http://schemas.microsoft.com/office/word/2010/wordprocessingShape" mc:Ignorable="w14 wp14">
+  <w:p>
+    <w:pPr>
+      <w:pStyle w:val="Footer"/>
+    </w:pPr>
+  </w:p>
+</w:ftr>
+</file>
+
+<file path=word/footer2.xml><?xml version="1.0" encoding="utf-8"?>
+<w:ftr xmlns:m="http://schemas.openxmlformats.org/officeDocument/2006/math" xmlns:mc="http://schemas.openxmlformats.org/markup-compatibility/2006" xmlns:mo="http://schemas.microsoft.com/office/mac/office/2008/main" xmlns:mv="urn:schemas-microsoft-com:mac:vml" xmlns:o="urn:schemas-microsoft-com:office:office" xmlns:r="http://schemas.openxmlformats.org/officeDocument/2006/relationships" xmlns:v="urn:schemas-microsoft-com:vml" xmlns:w10="urn:schemas-microsoft-com:office:word" xmlns:w14="http://schemas.microsoft.com/office/word/2010/wordml" xmlns:w="http://schemas.openxmlformats.org/wordprocessingml/2006/main" xmlns:wne="http://schemas.microsoft.com/office/word/2006/wordml" xmlns:wp14="http://schemas.microsoft.com/office/word/2010/wordprocessingDrawing" xmlns:wp="http://schemas.openxmlformats.org/drawingml/2006/wordprocessingDrawing" xmlns:wpc="http://schemas.microsoft.com/office/word/2010/wordprocessingCanvas" xmlns:wpg="http://schemas.microsoft.com/office/word/2010/wordprocessingGroup" xmlns:wpi="http://schemas.microsoft.com/office/word/2010/wordprocessingInk" xmlns:wps="http://schemas.microsoft.com/office/word/2010/wordprocessingShape" mc:Ignorable="w14 wp14">
+  <w:p>
+    <w:pPr>
+      <w:pStyle w:val="Footer"/>
+      <w:jc w:val="center"/>
+    </w:pPr>
+    <w:r>
+      <w:rPr>
+        <w:rFonts w:ascii="Times New Roman" w:hAnsi="Times New Roman" w:eastAsia="宋体"/>
+        <w:b w:val="0"/>
+        <w:sz w:val="20"/>
+      </w:rPr>
+      <w:t xml:space="preserve">- </w:t>
+    </w:r>
+    <w:r>
+      <w:rPr>
+        <w:rFonts w:ascii="Times New Roman" w:hAnsi="Times New Roman" w:eastAsia="宋体"/>
+        <w:b w:val="0"/>
+        <w:sz w:val="24"/>
+      </w:rPr>
+      <w:fldChar w:fldCharType="begin"/>
+      <w:instrText xml:space="preserve">PAGE</w:instrText>
+      <w:fldChar w:fldCharType="separate"/>
+      <w:fldChar w:fldCharType="end"/>
+    </w:r>
+    <w:r>
+      <w:rPr>
+        <w:rFonts w:ascii="Times New Roman" w:hAnsi="Times New Roman" w:eastAsia="宋体"/>
+        <w:b w:val="0"/>
+        <w:sz w:val="20"/>
+      </w:rPr>
+      <w:t xml:space="preserve"> -</w:t>
+    </w:r>
+  </w:p>
+</w:ftr>
+</file>
+
+<file path=word/footer3.xml><?xml version="1.0" encoding="utf-8"?>
+<w:ftr xmlns:m="http://schemas.openxmlformats.org/officeDocument/2006/math" xmlns:mc="http://schemas.openxmlformats.org/markup-compatibility/2006" xmlns:mo="http://schemas.microsoft.com/office/mac/office/2008/main" xmlns:mv="urn:schemas-microsoft-com:mac:vml" xmlns:o="urn:schemas-microsoft-com:office:office" xmlns:r="http://schemas.openxmlformats.org/officeDocument/2006/relationships" xmlns:v="urn:schemas-microsoft-com:vml" xmlns:w10="urn:schemas-microsoft-com:office:word" xmlns:w14="http://schemas.microsoft.com/office/word/2010/wordml" xmlns:w="http://schemas.openxmlformats.org/wordprocessingml/2006/main" xmlns:wne="http://schemas.microsoft.com/office/word/2006/wordml" xmlns:wp14="http://schemas.microsoft.com/office/word/2010/wordprocessingDrawing" xmlns:wp="http://schemas.openxmlformats.org/drawingml/2006/wordprocessingDrawing" xmlns:wpc="http://schemas.microsoft.com/office/word/2010/wordprocessingCanvas" xmlns:wpg="http://schemas.microsoft.com/office/word/2010/wordprocessingGroup" xmlns:wpi="http://schemas.microsoft.com/office/word/2010/wordprocessingInk" xmlns:wps="http://schemas.microsoft.com/office/word/2010/wordprocessingShape" mc:Ignorable="w14 wp14">
+  <w:p>
+    <w:pPr>
+      <w:pStyle w:val="Footer"/>
+      <w:jc w:val="center"/>
+    </w:pPr>
+    <w:r>
+      <w:rPr>
+        <w:rFonts w:ascii="Times New Roman" w:hAnsi="Times New Roman" w:eastAsia="宋体"/>
+        <w:b w:val="0"/>
+        <w:sz w:val="20"/>
+      </w:rPr>
+      <w:t xml:space="preserve">- </w:t>
+    </w:r>
+    <w:r>
+      <w:rPr>
+        <w:rFonts w:ascii="Times New Roman" w:hAnsi="Times New Roman" w:eastAsia="宋体"/>
+        <w:b w:val="0"/>
+        <w:sz w:val="24"/>
+      </w:rPr>
+      <w:fldChar w:fldCharType="begin"/>
+      <w:instrText xml:space="preserve">PAGE</w:instrText>
+      <w:fldChar w:fldCharType="separate"/>
+      <w:fldChar w:fldCharType="end"/>
+    </w:r>
+    <w:r>
+      <w:rPr>
+        <w:rFonts w:ascii="Times New Roman" w:hAnsi="Times New Roman" w:eastAsia="宋体"/>
+        <w:b w:val="0"/>
+        <w:sz w:val="20"/>
+      </w:rPr>
+      <w:t xml:space="preserve"> -</w:t>
+    </w:r>
+  </w:p>
+</w:ftr>
+</file>
+
+<file path=word/header1.xml><?xml version="1.0" encoding="utf-8"?>
+<w:hdr xmlns:m="http://schemas.openxmlformats.org/officeDocument/2006/math" xmlns:mc="http://schemas.openxmlformats.org/markup-compatibility/2006" xmlns:mo="http://schemas.microsoft.com/office/mac/office/2008/main" xmlns:mv="urn:schemas-microsoft-com:mac:vml" xmlns:o="urn:schemas-microsoft-com:office:office" xmlns:r="http://schemas.openxmlformats.org/officeDocument/2006/relationships" xmlns:v="urn:schemas-microsoft-com:vml" xmlns:w10="urn:schemas-microsoft-com:office:word" xmlns:w14="http://schemas.microsoft.com/office/word/2010/wordml" xmlns:w="http://schemas.openxmlformats.org/wordprocessingml/2006/main" xmlns:wne="http://schemas.microsoft.com/office/word/2006/wordml" xmlns:wp14="http://schemas.microsoft.com/office/word/2010/wordprocessingDrawing" xmlns:wp="http://schemas.openxmlformats.org/drawingml/2006/wordprocessingDrawing" xmlns:wpc="http://schemas.microsoft.com/office/word/2010/wordprocessingCanvas" xmlns:wpg="http://schemas.microsoft.com/office/word/2010/wordprocessingGroup" xmlns:wpi="http://schemas.microsoft.com/office/word/2010/wordprocessingInk" xmlns:wps="http://schemas.microsoft.com/office/word/2010/wordprocessingShape" mc:Ignorable="w14 wp14">
+  <w:p>
+    <w:pPr>
+      <w:pStyle w:val="Header"/>
+    </w:pPr>
+  </w:p>
+</w:hdr>
+</file>
+
+<file path=word/header2.xml><?xml version="1.0" encoding="utf-8"?>
+<w:hdr xmlns:m="http://schemas.openxmlformats.org/officeDocument/2006/math" xmlns:mc="http://schemas.openxmlformats.org/markup-compatibility/2006" xmlns:mo="http://schemas.microsoft.com/office/mac/office/2008/main" xmlns:mv="urn:schemas-microsoft-com:mac:vml" xmlns:o="urn:schemas-microsoft-com:office:office" xmlns:r="http://schemas.openxmlformats.org/officeDocument/2006/relationships" xmlns:v="urn:schemas-microsoft-com:vml" xmlns:w10="urn:schemas-microsoft-com:office:word" xmlns:w14="http://schemas.microsoft.com/office/word/2010/wordml" xmlns:w="http://schemas.openxmlformats.org/wordprocessingml/2006/main" xmlns:wne="http://schemas.microsoft.com/office/word/2006/wordml" xmlns:wp14="http://schemas.microsoft.com/office/word/2010/wordprocessingDrawing" xmlns:wp="http://schemas.openxmlformats.org/drawingml/2006/wordprocessingDrawing" xmlns:wpc="http://schemas.microsoft.com/office/word/2010/wordprocessingCanvas" xmlns:wpg="http://schemas.microsoft.com/office/word/2010/wordprocessingGroup" xmlns:wpi="http://schemas.microsoft.com/office/word/2010/wordprocessingInk" xmlns:wps="http://schemas.microsoft.com/office/word/2010/wordprocessingShape" mc:Ignorable="w14 wp14">
+  <w:p>
+    <w:pPr>
+      <w:pStyle w:val="Header"/>
+      <w:jc w:val="center"/>
+    </w:pPr>
+    <w:r>
+      <w:rPr>
+        <w:rFonts w:ascii="Times New Roman" w:hAnsi="Times New Roman" w:eastAsia="宋体"/>
+        <w:b w:val="0"/>
+        <w:sz w:val="20"/>
+      </w:rPr>
+      <w:t>浙江科技大学计算机科学与技术学院    2026 届本科毕业设计（论文）</w:t>
+    </w:r>
+  </w:p>
+</w:hdr>
+</file>
+
+<file path=word/header3.xml><?xml version="1.0" encoding="utf-8"?>
+<w:hdr xmlns:m="http://schemas.openxmlformats.org/officeDocument/2006/math" xmlns:mc="http://schemas.openxmlformats.org/markup-compatibility/2006" xmlns:mo="http://schemas.microsoft.com/office/mac/office/2008/main" xmlns:mv="urn:schemas-microsoft-com:mac:vml" xmlns:o="urn:schemas-microsoft-com:office:office" xmlns:r="http://schemas.openxmlformats.org/officeDocument/2006/relationships" xmlns:v="urn:schemas-microsoft-com:vml" xmlns:w10="urn:schemas-microsoft-com:office:word" xmlns:w14="http://schemas.microsoft.com/office/word/2010/wordml" xmlns:w="http://schemas.openxmlformats.org/wordprocessingml/2006/main" xmlns:wne="http://schemas.microsoft.com/office/word/2006/wordml" xmlns:wp14="http://schemas.microsoft.com/office/word/2010/wordprocessingDrawing" xmlns:wp="http://schemas.openxmlformats.org/drawingml/2006/wordprocessingDrawing" xmlns:wpc="http://schemas.microsoft.com/office/word/2010/wordprocessingCanvas" xmlns:wpg="http://schemas.microsoft.com/office/word/2010/wordprocessingGroup" xmlns:wpi="http://schemas.microsoft.com/office/word/2010/wordprocessingInk" xmlns:wps="http://schemas.microsoft.com/office/word/2010/wordprocessingShape" mc:Ignorable="w14 wp14">
+  <w:p>
+    <w:pPr>
+      <w:pStyle w:val="Header"/>
+      <w:jc w:val="center"/>
+    </w:pPr>
+    <w:r>
+      <w:rPr>
+        <w:rFonts w:ascii="Times New Roman" w:hAnsi="Times New Roman" w:eastAsia="宋体"/>
+        <w:b w:val="0"/>
+        <w:sz w:val="20"/>
+      </w:rPr>
+      <w:t>浙江科技大学计算机科学与技术学院    2026 届本科毕业设计（论文）</w:t>
+    </w:r>
+  </w:p>
+</w:hdr>
 </file>
 
 <file path=word/numbering.xml><?xml version="1.0" encoding="utf-8"?>
@@ -1661,6 +2125,10 @@
     <w:name w:val="Normal"/>
     <w:qFormat/>
     <w:rsid w:val="00FC693F"/>
+    <w:rPr>
+      <w:rFonts w:ascii="Times New Roman" w:hAnsi="Times New Roman" w:eastAsia="宋体"/>
+      <w:sz w:val="24"/>
+    </w:rPr>
   </w:style>
   <w:style w:type="paragraph" w:styleId="Header">
     <w:name w:val="header"/>
@@ -1721,11 +2189,11 @@
       <w:outlineLvl w:val="0"/>
     </w:pPr>
     <w:rPr>
-      <w:rFonts w:asciiTheme="majorHAnsi" w:eastAsiaTheme="majorEastAsia" w:hAnsiTheme="majorHAnsi" w:cstheme="majorBidi"/>
+      <w:rFonts w:asciiTheme="majorHAnsi" w:eastAsiaTheme="majorEastAsia" w:hAnsiTheme="majorHAnsi" w:cstheme="majorBidi" w:ascii="Times New Roman" w:hAnsi="Times New Roman" w:eastAsia="黑体"/>
       <w:b/>
       <w:bCs/>
       <w:color w:val="365F91" w:themeColor="accent1" w:themeShade="BF"/>
-      <w:sz w:val="28"/>
+      <w:sz w:val="32"/>
       <w:szCs w:val="28"/>
     </w:rPr>
   </w:style>
@@ -1745,11 +2213,11 @@
       <w:outlineLvl w:val="1"/>
     </w:pPr>
     <w:rPr>
-      <w:rFonts w:asciiTheme="majorHAnsi" w:eastAsiaTheme="majorEastAsia" w:hAnsiTheme="majorHAnsi" w:cstheme="majorBidi"/>
+      <w:rFonts w:asciiTheme="majorHAnsi" w:eastAsiaTheme="majorEastAsia" w:hAnsiTheme="majorHAnsi" w:cstheme="majorBidi" w:ascii="Times New Roman" w:hAnsi="Times New Roman" w:eastAsia="黑体"/>
       <w:b/>
       <w:bCs/>
       <w:color w:val="4F81BD" w:themeColor="accent1"/>
-      <w:sz w:val="26"/>
+      <w:sz w:val="28"/>
       <w:szCs w:val="26"/>
     </w:rPr>
   </w:style>
@@ -1769,10 +2237,11 @@
       <w:outlineLvl w:val="2"/>
     </w:pPr>
     <w:rPr>
-      <w:rFonts w:asciiTheme="majorHAnsi" w:eastAsiaTheme="majorEastAsia" w:hAnsiTheme="majorHAnsi" w:cstheme="majorBidi"/>
+      <w:rFonts w:asciiTheme="majorHAnsi" w:eastAsiaTheme="majorEastAsia" w:hAnsiTheme="majorHAnsi" w:cstheme="majorBidi" w:ascii="Times New Roman" w:hAnsi="Times New Roman" w:eastAsia="黑体"/>
       <w:b/>
       <w:bCs/>
       <w:color w:val="4F81BD" w:themeColor="accent1"/>
+      <w:sz w:val="24"/>
     </w:rPr>
   </w:style>
   <w:style w:type="paragraph" w:styleId="Heading4">

</xml_diff>